<commit_message>
CH4323: notify class - Fiori URL from system constants instead of TVARVC
Co-Authored-By: Claude Opus 5.5 <noreply@anthropic.com>
Claude-Session: https://claude.ai/code/session_01Dtdvzu1Y765XursKbvvneo
</commit_message>
<xml_diff>
--- a/docs/CH4323_VA02_change_approval_design.docx
+++ b/docs/CH4323_VA02_change_approval_design.docx
@@ -4334,7 +4334,7 @@
                 <w:sz w:val="17"/>
                 <w:szCs w:val="17"/>
               </w:rPr>
-              <w:t xml:space="preserve">ZSD_SO_FLP_BASE</w:t>
+              <w:t xml:space="preserve">GC_SYSID_PRD / GC_FLP_BASE_PRD / GC_FLP_BASE</w:t>
             </w:r>
           </w:p>
         </w:tc>
@@ -4363,7 +4363,7 @@
                 <w:sz w:val="17"/>
                 <w:szCs w:val="17"/>
               </w:rPr>
-              <w:t xml:space="preserve">TVARVC parameter</w:t>
+              <w:t xml:space="preserve">Constants in ZCL_SD_SO_CHG_NOTIFY</w:t>
             </w:r>
           </w:p>
         </w:tc>
@@ -4392,7 +4392,7 @@
                 <w:sz w:val="17"/>
                 <w:szCs w:val="17"/>
               </w:rPr>
-              <w:t xml:space="preserve">Fiori launchpad base URL for the My Inbox link</w:t>
+              <w:t xml:space="preserve">Fiori launchpad base URL for the My Inbox link (production / other systems)</w:t>
             </w:r>
           </w:p>
         </w:tc>
@@ -4421,7 +4421,7 @@
                 <w:sz w:val="17"/>
                 <w:szCs w:val="17"/>
               </w:rPr>
-              <w:t xml:space="preserve">STVARV</w:t>
+              <w:t xml:space="preserve">SE24</w:t>
             </w:r>
           </w:p>
         </w:tc>

</xml_diff>

<commit_message>
CH4323: workflow tasks background/dialog spec; FINISH_APPROVED releases only when all levels approved
Co-Authored-By: Claude Opus 5.5 <noreply@anthropic.com>
Claude-Session: https://claude.ai/code/session_01Dtdvzu1Y765XursKbvvneo
</commit_message>
<xml_diff>
--- a/docs/CH4323_VA02_change_approval_design.docx
+++ b/docs/CH4323_VA02_change_approval_design.docx
@@ -8971,6 +8971,50 @@
       </w:pPr>
       <w:r>
         <w:t xml:space="preserve">7.3 Steps</w:t>
+      </w:r>
+    </w:p>
+    <w:p>
+      <w:pPr>
+        <w:spacing w:after="100"/>
+      </w:pPr>
+      <w:r>
+        <w:t xml:space="preserve">Background (no agent, WF-BATCH): START, PREPARE_LEVEL, DECIDE, FINISH_APPROVED, FINISH_REJECTED.</w:t>
+      </w:r>
+    </w:p>
+    <w:p>
+      <w:pPr>
+        <w:spacing w:after="100"/>
+      </w:pPr>
+      <w:r>
+        <w:t xml:space="preserve">Dialog: only the User Decision step 3.2 (agent = approver of the level, Fiori My Inbox).</w:t>
+      </w:r>
+    </w:p>
+    <w:p>
+      <w:pPr>
+        <w:spacing w:after="100"/>
+      </w:pPr>
+      <w:r>
+        <w:t xml:space="preserve">The delivery block is removed only by FINISH_APPROVED, once, after the </w:t>
+      </w:r>
+      <w:r>
+        <w:rPr>
+          <w:b/>
+          <w:bCs/>
+        </w:rPr>
+        <w:t xml:space="preserve">last</w:t>
+      </w:r>
+      <w:r>
+        <w:t xml:space="preserve"> level approved. FINISH_APPROVED also refuses the release if any level in the log is not </w:t>
+      </w:r>
+      <w:r>
+        <w:rPr>
+          <w:i/>
+          <w:iCs/>
+        </w:rPr>
+        <w:t xml:space="preserve">Approved</w:t>
+      </w:r>
+      <w:r>
+        <w:t xml:space="preserve">.</w:t>
       </w:r>
     </w:p>
     <w:p>

</xml_diff>

<commit_message>
CH4323: guide 18.5 - HTML work item description setup in SWDD
Co-Authored-By: Claude Opus 5.5 <noreply@anthropic.com>
Claude-Session: https://claude.ai/code/session_01Dtdvzu1Y765XursKbvvneo
</commit_message>
<xml_diff>
--- a/docs/CH4323_VA02_change_approval_design.docx
+++ b/docs/CH4323_VA02_change_approval_design.docx
@@ -8821,6 +8821,88 @@
                 <w:sz w:val="17"/>
                 <w:szCs w:val="17"/>
               </w:rPr>
+              <w:t xml:space="preserve">HTML_DESC</w:t>
+            </w:r>
+          </w:p>
+        </w:tc>
+        <w:tc>
+          <w:tcPr>
+            <w:tcW w:type="dxa" w:w="5452"/>
+            <w:tcBorders>
+              <w:top w:val="single" w:color="BFBFBF" w:sz="4"/>
+              <w:left w:val="single" w:color="BFBFBF" w:sz="4"/>
+              <w:bottom w:val="single" w:color="BFBFBF" w:sz="4"/>
+              <w:right w:val="single" w:color="BFBFBF" w:sz="4"/>
+            </w:tcBorders>
+            <w:tcMar>
+              <w:top w:type="dxa" w:w="50"/>
+              <w:left w:type="dxa" w:w="90"/>
+              <w:bottom w:type="dxa" w:w="50"/>
+              <w:right w:type="dxa" w:w="90"/>
+            </w:tcMar>
+          </w:tcPr>
+          <w:p>
+            <w:pPr>
+              <w:spacing w:after="0" w:before="0"/>
+            </w:pPr>
+            <w:r>
+              <w:rPr>
+                <w:sz w:val="17"/>
+                <w:szCs w:val="17"/>
+              </w:rPr>
+              <w:t xml:space="preserve">W3HTML (multiline)</w:t>
+            </w:r>
+          </w:p>
+        </w:tc>
+        <w:tc>
+          <w:tcPr>
+            <w:tcW w:type="dxa" w:w="1559"/>
+            <w:tcBorders>
+              <w:top w:val="single" w:color="BFBFBF" w:sz="4"/>
+              <w:left w:val="single" w:color="BFBFBF" w:sz="4"/>
+              <w:bottom w:val="single" w:color="BFBFBF" w:sz="4"/>
+              <w:right w:val="single" w:color="BFBFBF" w:sz="4"/>
+            </w:tcBorders>
+            <w:tcMar>
+              <w:top w:type="dxa" w:w="50"/>
+              <w:left w:type="dxa" w:w="90"/>
+              <w:bottom w:type="dxa" w:w="50"/>
+              <w:right w:type="dxa" w:w="90"/>
+            </w:tcMar>
+          </w:tcPr>
+          <w:p>
+            <w:pPr>
+              <w:spacing w:after="0" w:before="0"/>
+            </w:pPr>
+          </w:p>
+        </w:tc>
+      </w:tr>
+      <w:tr>
+        <w:tc>
+          <w:tcPr>
+            <w:tcW w:type="dxa" w:w="2855"/>
+            <w:tcBorders>
+              <w:top w:val="single" w:color="BFBFBF" w:sz="4"/>
+              <w:left w:val="single" w:color="BFBFBF" w:sz="4"/>
+              <w:bottom w:val="single" w:color="BFBFBF" w:sz="4"/>
+              <w:right w:val="single" w:color="BFBFBF" w:sz="4"/>
+            </w:tcBorders>
+            <w:tcMar>
+              <w:top w:type="dxa" w:w="50"/>
+              <w:left w:type="dxa" w:w="90"/>
+              <w:bottom w:type="dxa" w:w="50"/>
+              <w:right w:type="dxa" w:w="90"/>
+            </w:tcMar>
+          </w:tcPr>
+          <w:p>
+            <w:pPr>
+              <w:spacing w:after="0" w:before="0"/>
+            </w:pPr>
+            <w:r>
+              <w:rPr>
+                <w:sz w:val="17"/>
+                <w:szCs w:val="17"/>
+              </w:rPr>
               <w:t xml:space="preserve">REJECTED</w:t>
             </w:r>
           </w:p>
@@ -9074,7 +9156,7 @@
           <w:sz w:val="15"/>
           <w:szCs w:val="15"/>
         </w:rPr>
-        <w:t xml:space="preserve">   3.1 Activity      PREPARE_LEVEL  LOG_ID, LEVEL_INDEX -&gt; LEVEL, AGENTS</w:t>
+        <w:t xml:space="preserve">   3.1 Activity      PREPARE_LEVEL  LOG_ID, LEVEL_INDEX -&gt; LEVEL, AGENTS, HTML_DESC</w:t>
       </w:r>
     </w:p>
     <w:p>
@@ -9229,6 +9311,43 @@
       </w:r>
       <w:r>
         <w:t xml:space="preserve"> then finds the running workflow of the order itself.</w:t>
+      </w:r>
+    </w:p>
+    <w:p>
+      <w:pPr>
+        <w:pStyle w:val="ListParagraph"/>
+        <w:numPr>
+          <w:ilvl w:val="0"/>
+          <w:numId w:val="3"/>
+        </w:numPr>
+        <w:spacing w:after="40"/>
+      </w:pPr>
+      <w:r>
+        <w:t xml:space="preserve">Work item description: </w:t>
+      </w:r>
+      <w:r>
+        <w:rPr>
+          <w:rFonts w:ascii="Consolas" w:cs="Consolas" w:eastAsia="Consolas" w:hAnsi="Consolas"/>
+          <w:color w:val="1F4E79"/>
+          <w:sz w:val="18"/>
+          <w:szCs w:val="18"/>
+        </w:rPr>
+        <w:t xml:space="preserve">&amp;HTML_DESC&amp;</w:t>
+      </w:r>
+      <w:r>
+        <w:t xml:space="preserve">, built by PREPARE_LEVEL with ZCL_SD_SO_CHG_NOTIFY-&gt;BUILD_INBOX_HTML. It has the same content as the approver e-mail, without </w:t>
+      </w:r>
+      <w:r>
+        <w:rPr>
+          <w:rFonts w:ascii="Consolas" w:cs="Consolas" w:eastAsia="Consolas" w:hAnsi="Consolas"/>
+          <w:color w:val="1F4E79"/>
+          <w:sz w:val="18"/>
+          <w:szCs w:val="18"/>
+        </w:rPr>
+        <w:t xml:space="preserve">&amp;</w:t>
+      </w:r>
+      <w:r>
+        <w:t xml:space="preserve"> and without HTML entities, so My Inbox does not read it as variables.</w:t>
       </w:r>
     </w:p>
     <w:p>

</xml_diff>

<commit_message>
CH4323: after rejection order open for change, delivery block kept (IS_REJECTED / IS_BLOCK_KEPT)
Co-Authored-By: Claude Opus 5.5 <noreply@anthropic.com>
Claude-Session: https://claude.ai/code/session_01Dtdvzu1Y765XursKbvvneo
</commit_message>
<xml_diff>
--- a/docs/CH4323_VA02_change_approval_design.docx
+++ b/docs/CH4323_VA02_change_approval_design.docx
@@ -479,6 +479,39 @@
       </w:pPr>
       <w:r>
         <w:t xml:space="preserve">After approval or rejection the order can be changed again. A new monitored change starts a new run and a new workflow.</w:t>
+      </w:r>
+    </w:p>
+    <w:p>
+      <w:pPr>
+        <w:pStyle w:val="ListParagraph"/>
+        <w:numPr>
+          <w:ilvl w:val="1"/>
+          <w:numId w:val="3"/>
+        </w:numPr>
+        <w:spacing w:after="40"/>
+      </w:pPr>
+      <w:r>
+        <w:rPr>
+          <w:b/>
+          <w:bCs/>
+        </w:rPr>
+        <w:t xml:space="preserve">After a rejection the delivery block stays.</w:t>
+      </w:r>
+      <w:r>
+        <w:t xml:space="preserve"> The order is open for change, but the delivery block field is closed and is set again on every save.</w:t>
+      </w:r>
+    </w:p>
+    <w:p>
+      <w:pPr>
+        <w:pStyle w:val="ListParagraph"/>
+        <w:numPr>
+          <w:ilvl w:val="1"/>
+          <w:numId w:val="3"/>
+        </w:numPr>
+        <w:spacing w:after="40"/>
+      </w:pPr>
+      <w:r>
+        <w:t xml:space="preserve">The block can only be removed by approving a new change.</w:t>
       </w:r>
     </w:p>
     <w:p>
@@ -8076,6 +8109,419 @@
         <w:spacing w:after="100"/>
       </w:pPr>
       <w:r>
+        <w:t xml:space="preserve">After a </w:t>
+      </w:r>
+      <w:r>
+        <w:rPr>
+          <w:b/>
+          <w:bCs/>
+        </w:rPr>
+        <w:t xml:space="preserve">rejection</w:t>
+      </w:r>
+      <w:r>
+        <w:t xml:space="preserve"> (latest run status R or E, </w:t>
+      </w:r>
+      <w:r>
+        <w:rPr>
+          <w:rFonts w:ascii="Consolas" w:cs="Consolas" w:eastAsia="Consolas" w:hAnsi="Consolas"/>
+          <w:color w:val="1F4E79"/>
+          <w:sz w:val="18"/>
+          <w:szCs w:val="18"/>
+        </w:rPr>
+        <w:t xml:space="preserve">IS_BLOCK_KEPT</w:t>
+      </w:r>
+      <w:r>
+        <w:t xml:space="preserve">), the order is open for change. Only the delivery block is protected:</w:t>
+      </w:r>
+    </w:p>
+    <w:tbl>
+      <w:tblPr>
+        <w:tblW w:type="dxa" w:w="9866"/>
+        <w:tblBorders>
+          <w:top w:val="single" w:color="auto" w:sz="4"/>
+          <w:left w:val="single" w:color="auto" w:sz="4"/>
+          <w:bottom w:val="single" w:color="auto" w:sz="4"/>
+          <w:right w:val="single" w:color="auto" w:sz="4"/>
+          <w:insideH w:val="single" w:color="auto" w:sz="4"/>
+          <w:insideV w:val="single" w:color="auto" w:sz="4"/>
+        </w:tblBorders>
+        <w:tblLayout w:type="fixed"/>
+      </w:tblPr>
+      <w:tblGrid>
+        <w:gridCol w:w="3288"/>
+        <w:gridCol w:w="6578"/>
+      </w:tblGrid>
+      <w:tr>
+        <w:trPr>
+          <w:tblHeader/>
+        </w:trPr>
+        <w:tc>
+          <w:tcPr>
+            <w:tcW w:type="dxa" w:w="3288"/>
+            <w:tcBorders>
+              <w:top w:val="single" w:color="BFBFBF" w:sz="4"/>
+              <w:left w:val="single" w:color="BFBFBF" w:sz="4"/>
+              <w:bottom w:val="single" w:color="BFBFBF" w:sz="4"/>
+              <w:right w:val="single" w:color="BFBFBF" w:sz="4"/>
+            </w:tcBorders>
+            <w:shd w:fill="1F4E79" w:color="auto" w:val="clear"/>
+            <w:tcMar>
+              <w:top w:type="dxa" w:w="50"/>
+              <w:left w:type="dxa" w:w="90"/>
+              <w:bottom w:type="dxa" w:w="50"/>
+              <w:right w:type="dxa" w:w="90"/>
+            </w:tcMar>
+          </w:tcPr>
+          <w:p>
+            <w:pPr>
+              <w:spacing w:after="0" w:before="0"/>
+            </w:pPr>
+            <w:r>
+              <w:rPr>
+                <w:b/>
+                <w:bCs/>
+                <w:color w:val="FFFFFF"/>
+                <w:sz w:val="17"/>
+                <w:szCs w:val="17"/>
+              </w:rPr>
+              <w:t xml:space="preserve">Where</w:t>
+            </w:r>
+          </w:p>
+        </w:tc>
+        <w:tc>
+          <w:tcPr>
+            <w:tcW w:type="dxa" w:w="6578"/>
+            <w:tcBorders>
+              <w:top w:val="single" w:color="BFBFBF" w:sz="4"/>
+              <w:left w:val="single" w:color="BFBFBF" w:sz="4"/>
+              <w:bottom w:val="single" w:color="BFBFBF" w:sz="4"/>
+              <w:right w:val="single" w:color="BFBFBF" w:sz="4"/>
+            </w:tcBorders>
+            <w:shd w:fill="1F4E79" w:color="auto" w:val="clear"/>
+            <w:tcMar>
+              <w:top w:type="dxa" w:w="50"/>
+              <w:left w:type="dxa" w:w="90"/>
+              <w:bottom w:type="dxa" w:w="50"/>
+              <w:right w:type="dxa" w:w="90"/>
+            </w:tcMar>
+          </w:tcPr>
+          <w:p>
+            <w:pPr>
+              <w:spacing w:after="0" w:before="0"/>
+            </w:pPr>
+            <w:r>
+              <w:rPr>
+                <w:b/>
+                <w:bCs/>
+                <w:color w:val="FFFFFF"/>
+                <w:sz w:val="17"/>
+                <w:szCs w:val="17"/>
+              </w:rPr>
+              <w:t xml:space="preserve">Effect in VA02 after rejection</w:t>
+            </w:r>
+          </w:p>
+        </w:tc>
+      </w:tr>
+      <w:tr>
+        <w:tc>
+          <w:tcPr>
+            <w:tcW w:type="dxa" w:w="3288"/>
+            <w:tcBorders>
+              <w:top w:val="single" w:color="BFBFBF" w:sz="4"/>
+              <w:left w:val="single" w:color="BFBFBF" w:sz="4"/>
+              <w:bottom w:val="single" w:color="BFBFBF" w:sz="4"/>
+              <w:right w:val="single" w:color="BFBFBF" w:sz="4"/>
+            </w:tcBorders>
+            <w:tcMar>
+              <w:top w:type="dxa" w:w="50"/>
+              <w:left w:type="dxa" w:w="90"/>
+              <w:bottom w:type="dxa" w:w="50"/>
+              <w:right w:type="dxa" w:w="90"/>
+            </w:tcMar>
+          </w:tcPr>
+          <w:p>
+            <w:pPr>
+              <w:spacing w:after="0" w:before="0"/>
+            </w:pPr>
+            <w:r>
+              <w:rPr>
+                <w:rFonts w:ascii="Consolas" w:cs="Consolas" w:eastAsia="Consolas" w:hAnsi="Consolas"/>
+                <w:color w:val="1F4E79"/>
+                <w:sz w:val="15"/>
+                <w:szCs w:val="15"/>
+              </w:rPr>
+              <w:t xml:space="preserve">USEREXIT_FIELD_MODIFICATION</w:t>
+            </w:r>
+          </w:p>
+        </w:tc>
+        <w:tc>
+          <w:tcPr>
+            <w:tcW w:type="dxa" w:w="6578"/>
+            <w:tcBorders>
+              <w:top w:val="single" w:color="BFBFBF" w:sz="4"/>
+              <w:left w:val="single" w:color="BFBFBF" w:sz="4"/>
+              <w:bottom w:val="single" w:color="BFBFBF" w:sz="4"/>
+              <w:right w:val="single" w:color="BFBFBF" w:sz="4"/>
+            </w:tcBorders>
+            <w:tcMar>
+              <w:top w:type="dxa" w:w="50"/>
+              <w:left w:type="dxa" w:w="90"/>
+              <w:bottom w:type="dxa" w:w="50"/>
+              <w:right w:type="dxa" w:w="90"/>
+            </w:tcMar>
+          </w:tcPr>
+          <w:p>
+            <w:pPr>
+              <w:spacing w:after="0" w:before="0"/>
+            </w:pPr>
+            <w:r>
+              <w:rPr>
+                <w:sz w:val="17"/>
+                <w:szCs w:val="17"/>
+              </w:rPr>
+              <w:t xml:space="preserve">Only </w:t>
+            </w:r>
+            <w:r>
+              <w:rPr>
+                <w:rFonts w:ascii="Consolas" w:cs="Consolas" w:eastAsia="Consolas" w:hAnsi="Consolas"/>
+                <w:color w:val="1F4E79"/>
+                <w:sz w:val="15"/>
+                <w:szCs w:val="15"/>
+              </w:rPr>
+              <w:t xml:space="preserve">VBAK-LIFSK</w:t>
+            </w:r>
+            <w:r>
+              <w:rPr>
+                <w:sz w:val="17"/>
+                <w:szCs w:val="17"/>
+              </w:rPr>
+              <w:t xml:space="preserve"> closed; all other fields open</w:t>
+            </w:r>
+          </w:p>
+        </w:tc>
+      </w:tr>
+      <w:tr>
+        <w:tc>
+          <w:tcPr>
+            <w:tcW w:type="dxa" w:w="3288"/>
+            <w:tcBorders>
+              <w:top w:val="single" w:color="BFBFBF" w:sz="4"/>
+              <w:left w:val="single" w:color="BFBFBF" w:sz="4"/>
+              <w:bottom w:val="single" w:color="BFBFBF" w:sz="4"/>
+              <w:right w:val="single" w:color="BFBFBF" w:sz="4"/>
+            </w:tcBorders>
+            <w:tcMar>
+              <w:top w:type="dxa" w:w="50"/>
+              <w:left w:type="dxa" w:w="90"/>
+              <w:bottom w:type="dxa" w:w="50"/>
+              <w:right w:type="dxa" w:w="90"/>
+            </w:tcMar>
+          </w:tcPr>
+          <w:p>
+            <w:pPr>
+              <w:spacing w:after="0" w:before="0"/>
+            </w:pPr>
+            <w:r>
+              <w:rPr>
+                <w:rFonts w:ascii="Consolas" w:cs="Consolas" w:eastAsia="Consolas" w:hAnsi="Consolas"/>
+                <w:color w:val="1F4E79"/>
+                <w:sz w:val="15"/>
+                <w:szCs w:val="15"/>
+              </w:rPr>
+              <w:t xml:space="preserve">USEREXIT_SAVE_DOCUMENT_PREPARE</w:t>
+            </w:r>
+          </w:p>
+        </w:tc>
+        <w:tc>
+          <w:tcPr>
+            <w:tcW w:type="dxa" w:w="6578"/>
+            <w:tcBorders>
+              <w:top w:val="single" w:color="BFBFBF" w:sz="4"/>
+              <w:left w:val="single" w:color="BFBFBF" w:sz="4"/>
+              <w:bottom w:val="single" w:color="BFBFBF" w:sz="4"/>
+              <w:right w:val="single" w:color="BFBFBF" w:sz="4"/>
+            </w:tcBorders>
+            <w:tcMar>
+              <w:top w:type="dxa" w:w="50"/>
+              <w:left w:type="dxa" w:w="90"/>
+              <w:bottom w:type="dxa" w:w="50"/>
+              <w:right w:type="dxa" w:w="90"/>
+            </w:tcMar>
+          </w:tcPr>
+          <w:p>
+            <w:pPr>
+              <w:spacing w:after="0" w:before="0"/>
+            </w:pPr>
+            <w:r>
+              <w:rPr>
+                <w:rFonts w:ascii="Consolas" w:cs="Consolas" w:eastAsia="Consolas" w:hAnsi="Consolas"/>
+                <w:color w:val="1F4E79"/>
+                <w:sz w:val="15"/>
+                <w:szCs w:val="15"/>
+              </w:rPr>
+              <w:t xml:space="preserve">LIFSK = XX</w:t>
+            </w:r>
+            <w:r>
+              <w:rPr>
+                <w:sz w:val="17"/>
+                <w:szCs w:val="17"/>
+              </w:rPr>
+              <w:t xml:space="preserve"> set again on every save</w:t>
+            </w:r>
+          </w:p>
+        </w:tc>
+      </w:tr>
+      <w:tr>
+        <w:tc>
+          <w:tcPr>
+            <w:tcW w:type="dxa" w:w="3288"/>
+            <w:tcBorders>
+              <w:top w:val="single" w:color="BFBFBF" w:sz="4"/>
+              <w:left w:val="single" w:color="BFBFBF" w:sz="4"/>
+              <w:bottom w:val="single" w:color="BFBFBF" w:sz="4"/>
+              <w:right w:val="single" w:color="BFBFBF" w:sz="4"/>
+            </w:tcBorders>
+            <w:tcMar>
+              <w:top w:type="dxa" w:w="50"/>
+              <w:left w:type="dxa" w:w="90"/>
+              <w:bottom w:type="dxa" w:w="50"/>
+              <w:right w:type="dxa" w:w="90"/>
+            </w:tcMar>
+          </w:tcPr>
+          <w:p>
+            <w:pPr>
+              <w:spacing w:after="0" w:before="0"/>
+            </w:pPr>
+            <w:r>
+              <w:rPr>
+                <w:rFonts w:ascii="Consolas" w:cs="Consolas" w:eastAsia="Consolas" w:hAnsi="Consolas"/>
+                <w:color w:val="1F4E79"/>
+                <w:sz w:val="15"/>
+                <w:szCs w:val="15"/>
+              </w:rPr>
+              <w:t xml:space="preserve">USEREXIT_READ_DOCUMENT</w:t>
+            </w:r>
+          </w:p>
+        </w:tc>
+        <w:tc>
+          <w:tcPr>
+            <w:tcW w:type="dxa" w:w="6578"/>
+            <w:tcBorders>
+              <w:top w:val="single" w:color="BFBFBF" w:sz="4"/>
+              <w:left w:val="single" w:color="BFBFBF" w:sz="4"/>
+              <w:bottom w:val="single" w:color="BFBFBF" w:sz="4"/>
+              <w:right w:val="single" w:color="BFBFBF" w:sz="4"/>
+            </w:tcBorders>
+            <w:tcMar>
+              <w:top w:type="dxa" w:w="50"/>
+              <w:left w:type="dxa" w:w="90"/>
+              <w:bottom w:type="dxa" w:w="50"/>
+              <w:right w:type="dxa" w:w="90"/>
+            </w:tcMar>
+          </w:tcPr>
+          <w:p>
+            <w:pPr>
+              <w:spacing w:after="0" w:before="0"/>
+            </w:pPr>
+            <w:r>
+              <w:rPr>
+                <w:sz w:val="17"/>
+                <w:szCs w:val="17"/>
+              </w:rPr>
+              <w:t xml:space="preserve">Message "change was rejected - delivery block stays until a new change is approved"</w:t>
+            </w:r>
+          </w:p>
+        </w:tc>
+      </w:tr>
+      <w:tr>
+        <w:tc>
+          <w:tcPr>
+            <w:tcW w:type="dxa" w:w="3288"/>
+            <w:tcBorders>
+              <w:top w:val="single" w:color="BFBFBF" w:sz="4"/>
+              <w:left w:val="single" w:color="BFBFBF" w:sz="4"/>
+              <w:bottom w:val="single" w:color="BFBFBF" w:sz="4"/>
+              <w:right w:val="single" w:color="BFBFBF" w:sz="4"/>
+            </w:tcBorders>
+            <w:tcMar>
+              <w:top w:type="dxa" w:w="50"/>
+              <w:left w:type="dxa" w:w="90"/>
+              <w:bottom w:type="dxa" w:w="50"/>
+              <w:right w:type="dxa" w:w="90"/>
+            </w:tcMar>
+          </w:tcPr>
+          <w:p>
+            <w:pPr>
+              <w:spacing w:after="0" w:before="0"/>
+            </w:pPr>
+            <w:r>
+              <w:rPr>
+                <w:rFonts w:ascii="Consolas" w:cs="Consolas" w:eastAsia="Consolas" w:hAnsi="Consolas"/>
+                <w:color w:val="1F4E79"/>
+                <w:sz w:val="15"/>
+                <w:szCs w:val="15"/>
+              </w:rPr>
+              <w:t xml:space="preserve">CUA_SETZEN</w:t>
+            </w:r>
+            <w:r>
+              <w:rPr>
+                <w:sz w:val="17"/>
+                <w:szCs w:val="17"/>
+              </w:rPr>
+              <w:t xml:space="preserve">, </w:t>
+            </w:r>
+            <w:r>
+              <w:rPr>
+                <w:rFonts w:ascii="Consolas" w:cs="Consolas" w:eastAsia="Consolas" w:hAnsi="Consolas"/>
+                <w:color w:val="1F4E79"/>
+                <w:sz w:val="15"/>
+                <w:szCs w:val="15"/>
+              </w:rPr>
+              <w:t xml:space="preserve">CE_C_PROCESSING</w:t>
+            </w:r>
+          </w:p>
+        </w:tc>
+        <w:tc>
+          <w:tcPr>
+            <w:tcW w:type="dxa" w:w="6578"/>
+            <w:tcBorders>
+              <w:top w:val="single" w:color="BFBFBF" w:sz="4"/>
+              <w:left w:val="single" w:color="BFBFBF" w:sz="4"/>
+              <w:bottom w:val="single" w:color="BFBFBF" w:sz="4"/>
+              <w:right w:val="single" w:color="BFBFBF" w:sz="4"/>
+            </w:tcBorders>
+            <w:tcMar>
+              <w:top w:type="dxa" w:w="50"/>
+              <w:left w:type="dxa" w:w="90"/>
+              <w:bottom w:type="dxa" w:w="50"/>
+              <w:right w:type="dxa" w:w="90"/>
+            </w:tcMar>
+          </w:tcPr>
+          <w:p>
+            <w:pPr>
+              <w:spacing w:after="0" w:before="0"/>
+            </w:pPr>
+            <w:r>
+              <w:rPr>
+                <w:sz w:val="17"/>
+                <w:szCs w:val="17"/>
+              </w:rPr>
+              <w:t xml:space="preserve">No lock (Insert/Delete and configuration open)</w:t>
+            </w:r>
+          </w:p>
+        </w:tc>
+      </w:tr>
+    </w:tbl>
+    <w:p>
+      <w:pPr>
+        <w:spacing w:after="80" w:before="0"/>
+      </w:pPr>
+    </w:p>
+    <w:p>
+      <w:pPr>
+        <w:spacing w:after="100"/>
+      </w:pPr>
+      <w:r>
         <w:t xml:space="preserve">Changes that do not come through the VA02 screens (BAPI, IDoc, mass change) are not locked.</w:t>
       </w:r>
     </w:p>
@@ -10461,7 +10907,7 @@
                 <w:sz w:val="17"/>
                 <w:szCs w:val="17"/>
               </w:rPr>
-              <w:t xml:space="preserve">Run R, level 3 N, block stays, requester mail; VA02 open again</w:t>
+              <w:t xml:space="preserve">Run R, level 3 N, block stays, requester mail; VA02 open again except the delivery block field; block set again on save</w:t>
             </w:r>
           </w:p>
         </w:tc>

</xml_diff>

<commit_message>
CH4323: cockpit report ZSD_SO_CHG_COCKPIT (filter / approver maintenance, log report)
Co-Authored-By: Claude Opus 5.5 <noreply@anthropic.com>
Claude-Session: https://claude.ai/code/session_01Dtdvzu1Y765XursKbvvneo
</commit_message>
<xml_diff>
--- a/docs/CH4323_VA02_change_approval_design.docx
+++ b/docs/CH4323_VA02_change_approval_design.docx
@@ -3192,6 +3192,155 @@
                 <w:szCs w:val="15"/>
               </w:rPr>
               <w:t xml:space="preserve">src/report/zsd_so_chg_wf_log.prog.abap</w:t>
+            </w:r>
+          </w:p>
+        </w:tc>
+      </w:tr>
+      <w:tr>
+        <w:tc>
+          <w:tcPr>
+            <w:tcW w:type="dxa" w:w="192"/>
+            <w:tcBorders>
+              <w:top w:val="single" w:color="BFBFBF" w:sz="4"/>
+              <w:left w:val="single" w:color="BFBFBF" w:sz="4"/>
+              <w:bottom w:val="single" w:color="BFBFBF" w:sz="4"/>
+              <w:right w:val="single" w:color="BFBFBF" w:sz="4"/>
+            </w:tcBorders>
+            <w:tcMar>
+              <w:top w:type="dxa" w:w="50"/>
+              <w:left w:type="dxa" w:w="90"/>
+              <w:bottom w:type="dxa" w:w="50"/>
+              <w:right w:type="dxa" w:w="90"/>
+            </w:tcMar>
+          </w:tcPr>
+          <w:p>
+            <w:pPr>
+              <w:spacing w:after="0" w:before="0"/>
+            </w:pPr>
+            <w:r>
+              <w:rPr>
+                <w:sz w:val="17"/>
+                <w:szCs w:val="17"/>
+              </w:rPr>
+              <w:t xml:space="preserve">14b</w:t>
+            </w:r>
+          </w:p>
+        </w:tc>
+        <w:tc>
+          <w:tcPr>
+            <w:tcW w:type="dxa" w:w="2261"/>
+            <w:tcBorders>
+              <w:top w:val="single" w:color="BFBFBF" w:sz="4"/>
+              <w:left w:val="single" w:color="BFBFBF" w:sz="4"/>
+              <w:bottom w:val="single" w:color="BFBFBF" w:sz="4"/>
+              <w:right w:val="single" w:color="BFBFBF" w:sz="4"/>
+            </w:tcBorders>
+            <w:tcMar>
+              <w:top w:type="dxa" w:w="50"/>
+              <w:left w:type="dxa" w:w="90"/>
+              <w:bottom w:type="dxa" w:w="50"/>
+              <w:right w:type="dxa" w:w="90"/>
+            </w:tcMar>
+          </w:tcPr>
+          <w:p>
+            <w:pPr>
+              <w:spacing w:after="0" w:before="0"/>
+            </w:pPr>
+            <w:r>
+              <w:rPr>
+                <w:sz w:val="17"/>
+                <w:szCs w:val="17"/>
+              </w:rPr>
+              <w:t xml:space="preserve">ZSD_SO_CHG_COCKPIT / ZSD_SOCHG_COCKPIT</w:t>
+            </w:r>
+          </w:p>
+        </w:tc>
+        <w:tc>
+          <w:tcPr>
+            <w:tcW w:type="dxa" w:w="1636"/>
+            <w:tcBorders>
+              <w:top w:val="single" w:color="BFBFBF" w:sz="4"/>
+              <w:left w:val="single" w:color="BFBFBF" w:sz="4"/>
+              <w:bottom w:val="single" w:color="BFBFBF" w:sz="4"/>
+              <w:right w:val="single" w:color="BFBFBF" w:sz="4"/>
+            </w:tcBorders>
+            <w:tcMar>
+              <w:top w:type="dxa" w:w="50"/>
+              <w:left w:type="dxa" w:w="90"/>
+              <w:bottom w:type="dxa" w:w="50"/>
+              <w:right w:type="dxa" w:w="90"/>
+            </w:tcMar>
+          </w:tcPr>
+          <w:p>
+            <w:pPr>
+              <w:spacing w:after="0" w:before="0"/>
+            </w:pPr>
+            <w:r>
+              <w:rPr>
+                <w:sz w:val="17"/>
+                <w:szCs w:val="17"/>
+              </w:rPr>
+              <w:t xml:space="preserve">Report / transaction</w:t>
+            </w:r>
+          </w:p>
+        </w:tc>
+        <w:tc>
+          <w:tcPr>
+            <w:tcW w:type="dxa" w:w="2887"/>
+            <w:tcBorders>
+              <w:top w:val="single" w:color="BFBFBF" w:sz="4"/>
+              <w:left w:val="single" w:color="BFBFBF" w:sz="4"/>
+              <w:bottom w:val="single" w:color="BFBFBF" w:sz="4"/>
+              <w:right w:val="single" w:color="BFBFBF" w:sz="4"/>
+            </w:tcBorders>
+            <w:tcMar>
+              <w:top w:type="dxa" w:w="50"/>
+              <w:left w:type="dxa" w:w="90"/>
+              <w:bottom w:type="dxa" w:w="50"/>
+              <w:right w:type="dxa" w:w="90"/>
+            </w:tcMar>
+          </w:tcPr>
+          <w:p>
+            <w:pPr>
+              <w:spacing w:after="0" w:before="0"/>
+            </w:pPr>
+            <w:r>
+              <w:rPr>
+                <w:sz w:val="17"/>
+                <w:szCs w:val="17"/>
+              </w:rPr>
+              <w:t xml:space="preserve">Cockpit: buttons for filter maintenance, approver maintenance, log report</w:t>
+            </w:r>
+          </w:p>
+        </w:tc>
+        <w:tc>
+          <w:tcPr>
+            <w:tcW w:type="dxa" w:w="2890"/>
+            <w:tcBorders>
+              <w:top w:val="single" w:color="BFBFBF" w:sz="4"/>
+              <w:left w:val="single" w:color="BFBFBF" w:sz="4"/>
+              <w:bottom w:val="single" w:color="BFBFBF" w:sz="4"/>
+              <w:right w:val="single" w:color="BFBFBF" w:sz="4"/>
+            </w:tcBorders>
+            <w:tcMar>
+              <w:top w:type="dxa" w:w="50"/>
+              <w:left w:type="dxa" w:w="90"/>
+              <w:bottom w:type="dxa" w:w="50"/>
+              <w:right w:type="dxa" w:w="90"/>
+            </w:tcMar>
+          </w:tcPr>
+          <w:p>
+            <w:pPr>
+              <w:spacing w:after="0" w:before="0"/>
+            </w:pPr>
+            <w:r>
+              <w:rPr>
+                <w:rFonts w:ascii="Consolas" w:cs="Consolas" w:eastAsia="Consolas" w:hAnsi="Consolas"/>
+                <w:color w:val="1F4E79"/>
+                <w:sz w:val="15"/>
+                <w:szCs w:val="15"/>
+              </w:rPr>
+              <w:t xml:space="preserve">src/report/zsd_so_chg_cockpit.prog.abap</w:t>
             </w:r>
           </w:p>
         </w:tc>

</xml_diff>